<commit_message>
Update Labour Laws I case law digest and consolidated notes
Co-Authored-By: Claude Sonnet 5 <noreply@anthropic.com>
</commit_message>
<xml_diff>
--- a/Labour Law/Labour_Laws_I_Case_Law_Digest.docx
+++ b/Labour Law/Labour_Laws_I_Case_Law_Digest.docx
@@ -230,7 +230,7 @@
           <w:sz w:val="22"/>
           <w:szCs w:val="22"/>
         </w:rPr>
-        <w:t xml:space="preserve">Fifty-two cases, arranged by topic rather than alphabetically, so each can be read against the doctrine it supports. Cross-references to the main notes are given by Part and section. Each entry gives the citation, the court and date, the material facts, the issue, the decision and the governing principle.</w:t>
+        <w:t xml:space="preserve">Forty-eight cases, arranged by topic rather than alphabetically, so each can be read against the doctrine it supports. Cross-references to the main notes are given by Part and section. Each entry gives the citation, the court and date, the material facts, the issue, the decision and the governing principle.</w:t>
       </w:r>
     </w:p>
     <w:p>
@@ -12524,7 +12524,7 @@
           <w:sz w:val="30"/>
           <w:szCs w:val="30"/>
         </w:rPr>
-        <w:t xml:space="preserve">7. The Concept of "Industry"</w:t>
+        <w:t xml:space="preserve">7. The Concept of "Industry" and Who Is the Employer</w:t>
       </w:r>
     </w:p>
     <w:p>
@@ -14030,10 +14030,9 @@
     </w:p>
     <w:p>
       <w:pPr>
-        <w:pStyle w:val="Heading1"/>
+        <w:pStyle w:val="Heading2"/>
         <w:keepNext/>
-        <w:pageBreakBefore/>
-        <w:spacing w:after="200" w:before="0"/>
+        <w:spacing w:after="140" w:before="320"/>
       </w:pPr>
       <w:r>
         <w:rPr>
@@ -14041,10 +14040,10 @@
           <w:b/>
           <w:bCs/>
           <w:color w:val="1A1A1A"/>
-          <w:sz w:val="30"/>
-          <w:szCs w:val="30"/>
-        </w:rPr>
-        <w:t xml:space="preserve">9. Standing Orders and Contract Labour</w:t>
+          <w:sz w:val="25"/>
+          <w:szCs w:val="25"/>
+        </w:rPr>
+        <w:t xml:space="preserve">Who Is the Employer?</w:t>
       </w:r>
     </w:p>
     <w:p>
@@ -14055,23 +14054,11 @@
       <w:r>
         <w:rPr>
           <w:rFonts w:ascii="Cambria" w:cs="Cambria" w:eastAsia="Cambria" w:hAnsi="Cambria"/>
-          <w:i/>
-          <w:iCs/>
           <w:sz w:val="22"/>
           <w:szCs w:val="22"/>
         </w:rPr>
-        <w:t xml:space="preserve">Main notes: Part XI.</w:t>
-      </w:r>
-    </w:p>
-    <w:p>
-      <w:pPr>
-        <w:keepNext/>
-        <w:pBdr>
-          <w:left w:val="single" w:color="808080" w:sz="12" w:space="8"/>
-        </w:pBdr>
-        <w:spacing w:after="80" w:before="200"/>
-        <w:ind w:left="172"/>
-      </w:pPr>
+        <w:t xml:space="preserve">A question closely related to coverage is who counts as the </w:t>
+      </w:r>
       <w:r>
         <w:rPr>
           <w:rFonts w:ascii="Cambria" w:cs="Cambria" w:eastAsia="Cambria" w:hAnsi="Cambria"/>
@@ -14080,1003 +14067,15 @@
           <w:sz w:val="22"/>
           <w:szCs w:val="22"/>
         </w:rPr>
-        <w:t xml:space="preserve">Western India Automobile Association v. Industrial Tribunal, Bombay, [1949] FCR 321; AIR 1949 FC 111</w:t>
-      </w:r>
-    </w:p>
-    <w:p>
-      <w:pPr>
-        <w:spacing w:after="80" w:line="270"/>
-        <w:ind w:left="345"/>
-        <w:jc w:val="both"/>
-      </w:pPr>
-      <w:r>
-        <w:rPr>
-          <w:rFonts w:ascii="Cambria" w:cs="Cambria" w:eastAsia="Cambria" w:hAnsi="Cambria"/>
-          <w:b/>
-          <w:bCs/>
-          <w:i/>
-          <w:iCs/>
-          <w:sz w:val="21"/>
-          <w:szCs w:val="21"/>
-        </w:rPr>
-        <w:t xml:space="preserve">Court and date. </w:t>
-      </w:r>
-      <w:r>
-        <w:rPr>
-          <w:rFonts w:ascii="Cambria" w:cs="Cambria" w:eastAsia="Cambria" w:hAnsi="Cambria"/>
-          <w:sz w:val="21"/>
-          <w:szCs w:val="21"/>
-        </w:rPr>
-        <w:t xml:space="preserve">Federal Court of India, 1949, on appeal from the Bombay High Court.</w:t>
-      </w:r>
-    </w:p>
-    <w:p>
-      <w:pPr>
-        <w:spacing w:after="80" w:line="270"/>
-        <w:ind w:left="345"/>
-        <w:jc w:val="both"/>
-      </w:pPr>
-      <w:r>
-        <w:rPr>
-          <w:rFonts w:ascii="Cambria" w:cs="Cambria" w:eastAsia="Cambria" w:hAnsi="Cambria"/>
-          <w:b/>
-          <w:bCs/>
-          <w:i/>
-          <w:iCs/>
-          <w:sz w:val="21"/>
-          <w:szCs w:val="21"/>
-        </w:rPr>
-        <w:t xml:space="preserve">Facts. </w:t>
-      </w:r>
-      <w:r>
-        <w:rPr>
-          <w:rFonts w:ascii="Cambria" w:cs="Cambria" w:eastAsia="Cambria" w:hAnsi="Cambria"/>
-          <w:sz w:val="21"/>
-          <w:szCs w:val="21"/>
-        </w:rPr>
-        <w:t xml:space="preserve">The Association’s workers went on strike and those who took part were </w:t>
-      </w:r>
-      <w:r>
-        <w:rPr>
-          <w:rFonts w:ascii="Cambria" w:cs="Cambria" w:eastAsia="Cambria" w:hAnsi="Cambria"/>
-          <w:b/>
-          <w:bCs/>
-          <w:sz w:val="21"/>
-          <w:szCs w:val="21"/>
-        </w:rPr>
-        <w:t xml:space="preserve">dismissed</w:t>
-      </w:r>
-      <w:r>
-        <w:rPr>
-          <w:rFonts w:ascii="Cambria" w:cs="Cambria" w:eastAsia="Cambria" w:hAnsi="Cambria"/>
-          <w:sz w:val="21"/>
-          <w:szCs w:val="21"/>
-        </w:rPr>
-        <w:t xml:space="preserve">. The Government referred the resulting disputes, including the </w:t>
-      </w:r>
-      <w:r>
-        <w:rPr>
-          <w:rFonts w:ascii="Cambria" w:cs="Cambria" w:eastAsia="Cambria" w:hAnsi="Cambria"/>
-          <w:b/>
-          <w:bCs/>
-          <w:sz w:val="21"/>
-          <w:szCs w:val="21"/>
-        </w:rPr>
-        <w:t xml:space="preserve">reinstatement of the dismissed workers</w:t>
-      </w:r>
-      <w:r>
-        <w:rPr>
-          <w:rFonts w:ascii="Cambria" w:cs="Cambria" w:eastAsia="Cambria" w:hAnsi="Cambria"/>
-          <w:sz w:val="21"/>
-          <w:szCs w:val="21"/>
-        </w:rPr>
-        <w:t xml:space="preserve">, to an Industrial Tribunal under the Industrial Disputes Act 1947. A single judge of the Bombay High Court issued a </w:t>
-      </w:r>
-      <w:r>
-        <w:rPr>
-          <w:rFonts w:ascii="Cambria" w:cs="Cambria" w:eastAsia="Cambria" w:hAnsi="Cambria"/>
-          <w:b/>
-          <w:bCs/>
-          <w:sz w:val="21"/>
-          <w:szCs w:val="21"/>
-        </w:rPr>
-        <w:t xml:space="preserve">writ of prohibition</w:t>
-      </w:r>
-      <w:r>
-        <w:rPr>
-          <w:rFonts w:ascii="Cambria" w:cs="Cambria" w:eastAsia="Cambria" w:hAnsi="Cambria"/>
-          <w:sz w:val="21"/>
-          <w:szCs w:val="21"/>
-        </w:rPr>
-        <w:t xml:space="preserve"> restraining the Tribunal from adjudicating on reinstatement, holding that although the Act applied the Tribunal could not order reinstatement. A Division Bench reversed him.</w:t>
-      </w:r>
-    </w:p>
-    <w:p>
-      <w:pPr>
-        <w:spacing w:after="80" w:line="270"/>
-        <w:ind w:left="345"/>
-        <w:jc w:val="both"/>
-      </w:pPr>
-      <w:r>
-        <w:rPr>
-          <w:rFonts w:ascii="Cambria" w:cs="Cambria" w:eastAsia="Cambria" w:hAnsi="Cambria"/>
-          <w:b/>
-          <w:bCs/>
-          <w:i/>
-          <w:iCs/>
-          <w:sz w:val="21"/>
-          <w:szCs w:val="21"/>
-        </w:rPr>
-        <w:t xml:space="preserve">Issue. </w:t>
-      </w:r>
-      <w:r>
-        <w:rPr>
-          <w:rFonts w:ascii="Cambria" w:cs="Cambria" w:eastAsia="Cambria" w:hAnsi="Cambria"/>
-          <w:sz w:val="21"/>
-          <w:szCs w:val="21"/>
-        </w:rPr>
-        <w:t xml:space="preserve">Whether an industrial tribunal may order reinstatement, and whether industrial adjudication is confined to the strict law of master and servant.</w:t>
-      </w:r>
-    </w:p>
-    <w:p>
-      <w:pPr>
-        <w:spacing w:after="80" w:line="270"/>
-        <w:ind w:left="345"/>
-        <w:jc w:val="both"/>
-      </w:pPr>
-      <w:r>
-        <w:rPr>
-          <w:rFonts w:ascii="Cambria" w:cs="Cambria" w:eastAsia="Cambria" w:hAnsi="Cambria"/>
-          <w:b/>
-          <w:bCs/>
-          <w:i/>
-          <w:iCs/>
-          <w:sz w:val="21"/>
-          <w:szCs w:val="21"/>
-        </w:rPr>
-        <w:t xml:space="preserve">Held. </w:t>
-      </w:r>
-      <w:r>
-        <w:rPr>
-          <w:rFonts w:ascii="Cambria" w:cs="Cambria" w:eastAsia="Cambria" w:hAnsi="Cambria"/>
-          <w:sz w:val="21"/>
-          <w:szCs w:val="21"/>
-        </w:rPr>
-        <w:t xml:space="preserve">A dispute about reinstatement of dismissed employees </w:t>
-      </w:r>
-      <w:r>
-        <w:rPr>
-          <w:rFonts w:ascii="Cambria" w:cs="Cambria" w:eastAsia="Cambria" w:hAnsi="Cambria"/>
-          <w:b/>
-          <w:bCs/>
-          <w:sz w:val="21"/>
-          <w:szCs w:val="21"/>
-        </w:rPr>
-        <w:t xml:space="preserve">is an industrial dispute</w:t>
-      </w:r>
-      <w:r>
-        <w:rPr>
-          <w:rFonts w:ascii="Cambria" w:cs="Cambria" w:eastAsia="Cambria" w:hAnsi="Cambria"/>
-          <w:sz w:val="21"/>
-          <w:szCs w:val="21"/>
-        </w:rPr>
-        <w:t xml:space="preserve">, and the Tribunal has jurisdiction to adjudicate it and to </w:t>
-      </w:r>
-      <w:r>
-        <w:rPr>
-          <w:rFonts w:ascii="Cambria" w:cs="Cambria" w:eastAsia="Cambria" w:hAnsi="Cambria"/>
-          <w:b/>
-          <w:bCs/>
-          <w:sz w:val="21"/>
-          <w:szCs w:val="21"/>
-        </w:rPr>
-        <w:t xml:space="preserve">order reinstatement</w:t>
-      </w:r>
-      <w:r>
-        <w:rPr>
-          <w:rFonts w:ascii="Cambria" w:cs="Cambria" w:eastAsia="Cambria" w:hAnsi="Cambria"/>
-          <w:sz w:val="21"/>
-          <w:szCs w:val="21"/>
-        </w:rPr>
-        <w:t xml:space="preserve">. Industrial adjudication is </w:t>
-      </w:r>
-      <w:r>
-        <w:rPr>
-          <w:rFonts w:ascii="Cambria" w:cs="Cambria" w:eastAsia="Cambria" w:hAnsi="Cambria"/>
-          <w:b/>
-          <w:bCs/>
-          <w:sz w:val="21"/>
-          <w:szCs w:val="21"/>
-        </w:rPr>
-        <w:t xml:space="preserve">not confined</w:t>
-      </w:r>
-      <w:r>
-        <w:rPr>
-          <w:rFonts w:ascii="Cambria" w:cs="Cambria" w:eastAsia="Cambria" w:hAnsi="Cambria"/>
-          <w:sz w:val="21"/>
-          <w:szCs w:val="21"/>
-        </w:rPr>
-        <w:t xml:space="preserve"> to enforcing the strict contractual law of master and servant: the Tribunal may create new obligations to secure industrial peace.</w:t>
-      </w:r>
-    </w:p>
-    <w:p>
-      <w:pPr>
-        <w:spacing w:after="80" w:line="270"/>
-        <w:ind w:left="345"/>
-        <w:jc w:val="both"/>
-      </w:pPr>
-      <w:r>
-        <w:rPr>
-          <w:rFonts w:ascii="Cambria" w:cs="Cambria" w:eastAsia="Cambria" w:hAnsi="Cambria"/>
-          <w:b/>
-          <w:bCs/>
-          <w:i/>
-          <w:iCs/>
-          <w:sz w:val="21"/>
-          <w:szCs w:val="21"/>
-        </w:rPr>
-        <w:t xml:space="preserve">Note. </w:t>
-      </w:r>
-      <w:r>
-        <w:rPr>
-          <w:rFonts w:ascii="Cambria" w:cs="Cambria" w:eastAsia="Cambria" w:hAnsi="Cambria"/>
-          <w:sz w:val="21"/>
-          <w:szCs w:val="21"/>
-        </w:rPr>
-        <w:t xml:space="preserve">Sometimes cited for the opposite proposition, that a manager has unqualified discretion to hire and fire. It does not support that; it </w:t>
-      </w:r>
-      <w:r>
-        <w:rPr>
-          <w:rFonts w:ascii="Cambria" w:cs="Cambria" w:eastAsia="Cambria" w:hAnsi="Cambria"/>
-          <w:b/>
-          <w:bCs/>
-          <w:sz w:val="21"/>
-          <w:szCs w:val="21"/>
-        </w:rPr>
-        <w:t xml:space="preserve">qualifies</w:t>
-      </w:r>
-      <w:r>
-        <w:rPr>
-          <w:rFonts w:ascii="Cambria" w:cs="Cambria" w:eastAsia="Cambria" w:hAnsi="Cambria"/>
-          <w:sz w:val="21"/>
-          <w:szCs w:val="21"/>
-        </w:rPr>
-        <w:t xml:space="preserve"> managerial discretion.</w:t>
-      </w:r>
-    </w:p>
-    <w:p>
-      <w:pPr>
-        <w:keepNext/>
-        <w:pBdr>
-          <w:left w:val="single" w:color="808080" w:sz="12" w:space="8"/>
-        </w:pBdr>
-        <w:spacing w:after="80" w:before="200"/>
-        <w:ind w:left="172"/>
-      </w:pPr>
-      <w:r>
-        <w:rPr>
-          <w:rFonts w:ascii="Cambria" w:cs="Cambria" w:eastAsia="Cambria" w:hAnsi="Cambria"/>
-          <w:b/>
-          <w:bCs/>
+        <w:t xml:space="preserve">employer</w:t>
+      </w:r>
+      <w:r>
+        <w:rPr>
+          <w:rFonts w:ascii="Cambria" w:cs="Cambria" w:eastAsia="Cambria" w:hAnsi="Cambria"/>
           <w:sz w:val="22"/>
           <w:szCs w:val="22"/>
         </w:rPr>
-        <w:t xml:space="preserve">Western India Match Company v. Workmen, AIR 1973 SC 2650; (1974) 3 SCC 330</w:t>
-      </w:r>
-    </w:p>
-    <w:p>
-      <w:pPr>
-        <w:spacing w:after="80" w:line="270"/>
-        <w:ind w:left="345"/>
-        <w:jc w:val="both"/>
-      </w:pPr>
-      <w:r>
-        <w:rPr>
-          <w:rFonts w:ascii="Cambria" w:cs="Cambria" w:eastAsia="Cambria" w:hAnsi="Cambria"/>
-          <w:b/>
-          <w:bCs/>
-          <w:i/>
-          <w:iCs/>
-          <w:sz w:val="21"/>
-          <w:szCs w:val="21"/>
-        </w:rPr>
-        <w:t xml:space="preserve">Court and date. </w:t>
-      </w:r>
-      <w:r>
-        <w:rPr>
-          <w:rFonts w:ascii="Cambria" w:cs="Cambria" w:eastAsia="Cambria" w:hAnsi="Cambria"/>
-          <w:sz w:val="21"/>
-          <w:szCs w:val="21"/>
-        </w:rPr>
-        <w:t xml:space="preserve">Supreme Court of India; K.K. Mathew, S.N. Dwivedi (author) and P. Jaganmohan Reddy JJ; 20 August 1973.</w:t>
-      </w:r>
-    </w:p>
-    <w:p>
-      <w:pPr>
-        <w:spacing w:after="80" w:line="270"/>
-        <w:ind w:left="345"/>
-        <w:jc w:val="both"/>
-      </w:pPr>
-      <w:r>
-        <w:rPr>
-          <w:rFonts w:ascii="Cambria" w:cs="Cambria" w:eastAsia="Cambria" w:hAnsi="Cambria"/>
-          <w:b/>
-          <w:bCs/>
-          <w:i/>
-          <w:iCs/>
-          <w:sz w:val="21"/>
-          <w:szCs w:val="21"/>
-        </w:rPr>
-        <w:t xml:space="preserve">Facts. </w:t>
-      </w:r>
-      <w:r>
-        <w:rPr>
-          <w:rFonts w:ascii="Cambria" w:cs="Cambria" w:eastAsia="Cambria" w:hAnsi="Cambria"/>
-          <w:sz w:val="21"/>
-          <w:szCs w:val="21"/>
-        </w:rPr>
-        <w:t xml:space="preserve">The company at Bareilly was governed by the Industrial Employment (Standing Orders) Act 1946. Its certified Standing Order for </w:t>
-      </w:r>
-      <w:r>
-        <w:rPr>
-          <w:rFonts w:ascii="Cambria" w:cs="Cambria" w:eastAsia="Cambria" w:hAnsi="Cambria"/>
-          <w:b/>
-          <w:bCs/>
-          <w:sz w:val="21"/>
-          <w:szCs w:val="21"/>
-        </w:rPr>
-        <w:t xml:space="preserve">watch and ward staff</w:t>
-      </w:r>
-      <w:r>
-        <w:rPr>
-          <w:rFonts w:ascii="Cambria" w:cs="Cambria" w:eastAsia="Cambria" w:hAnsi="Cambria"/>
-          <w:sz w:val="21"/>
-          <w:szCs w:val="21"/>
-        </w:rPr>
-        <w:t xml:space="preserve"> provided a probation period of </w:t>
-      </w:r>
-      <w:r>
-        <w:rPr>
-          <w:rFonts w:ascii="Cambria" w:cs="Cambria" w:eastAsia="Cambria" w:hAnsi="Cambria"/>
-          <w:b/>
-          <w:bCs/>
-          <w:sz w:val="21"/>
-          <w:szCs w:val="21"/>
-        </w:rPr>
-        <w:t xml:space="preserve">two months</w:t>
-      </w:r>
-      <w:r>
-        <w:rPr>
-          <w:rFonts w:ascii="Cambria" w:cs="Cambria" w:eastAsia="Cambria" w:hAnsi="Cambria"/>
-          <w:sz w:val="21"/>
-          <w:szCs w:val="21"/>
-        </w:rPr>
-        <w:t xml:space="preserve"> for a permanent post. It appointed Prem Singh a watchman on </w:t>
-      </w:r>
-      <w:r>
-        <w:rPr>
-          <w:rFonts w:ascii="Cambria" w:cs="Cambria" w:eastAsia="Cambria" w:hAnsi="Cambria"/>
-          <w:b/>
-          <w:bCs/>
-          <w:sz w:val="21"/>
-          <w:szCs w:val="21"/>
-        </w:rPr>
-        <w:t xml:space="preserve">1 September 1965</w:t>
-      </w:r>
-      <w:r>
-        <w:rPr>
-          <w:rFonts w:ascii="Cambria" w:cs="Cambria" w:eastAsia="Cambria" w:hAnsi="Cambria"/>
-          <w:sz w:val="21"/>
-          <w:szCs w:val="21"/>
-        </w:rPr>
-        <w:t xml:space="preserve"> by a letter placing him on probation for </w:t>
-      </w:r>
-      <w:r>
-        <w:rPr>
-          <w:rFonts w:ascii="Cambria" w:cs="Cambria" w:eastAsia="Cambria" w:hAnsi="Cambria"/>
-          <w:b/>
-          <w:bCs/>
-          <w:sz w:val="21"/>
-          <w:szCs w:val="21"/>
-        </w:rPr>
-        <w:t xml:space="preserve">six months</w:t>
-      </w:r>
-      <w:r>
-        <w:rPr>
-          <w:rFonts w:ascii="Cambria" w:cs="Cambria" w:eastAsia="Cambria" w:hAnsi="Cambria"/>
-          <w:sz w:val="21"/>
-          <w:szCs w:val="21"/>
-        </w:rPr>
-        <w:t xml:space="preserve"> as a special agreement, later extended, and then discharged him. The union contended that on the expiry of two months he had automatically become permanent. The Labour Court set aside the discharge and ordered reinstatement.</w:t>
-      </w:r>
-    </w:p>
-    <w:p>
-      <w:pPr>
-        <w:spacing w:after="80" w:line="270"/>
-        <w:ind w:left="345"/>
-        <w:jc w:val="both"/>
-      </w:pPr>
-      <w:r>
-        <w:rPr>
-          <w:rFonts w:ascii="Cambria" w:cs="Cambria" w:eastAsia="Cambria" w:hAnsi="Cambria"/>
-          <w:b/>
-          <w:bCs/>
-          <w:i/>
-          <w:iCs/>
-          <w:sz w:val="21"/>
-          <w:szCs w:val="21"/>
-        </w:rPr>
-        <w:t xml:space="preserve">Issue. </w:t>
-      </w:r>
-      <w:r>
-        <w:rPr>
-          <w:rFonts w:ascii="Cambria" w:cs="Cambria" w:eastAsia="Cambria" w:hAnsi="Cambria"/>
-          <w:sz w:val="21"/>
-          <w:szCs w:val="21"/>
-        </w:rPr>
-        <w:t xml:space="preserve">Whether the individual contract or the Standing Order prevails where the two conflict.</w:t>
-      </w:r>
-    </w:p>
-    <w:p>
-      <w:pPr>
-        <w:spacing w:after="80" w:line="270"/>
-        <w:ind w:left="345"/>
-        <w:jc w:val="both"/>
-      </w:pPr>
-      <w:r>
-        <w:rPr>
-          <w:rFonts w:ascii="Cambria" w:cs="Cambria" w:eastAsia="Cambria" w:hAnsi="Cambria"/>
-          <w:b/>
-          <w:bCs/>
-          <w:i/>
-          <w:iCs/>
-          <w:sz w:val="21"/>
-          <w:szCs w:val="21"/>
-        </w:rPr>
-        <w:t xml:space="preserve">Held. </w:t>
-      </w:r>
-      <w:r>
-        <w:rPr>
-          <w:rFonts w:ascii="Cambria" w:cs="Cambria" w:eastAsia="Cambria" w:hAnsi="Cambria"/>
-          <w:sz w:val="21"/>
-          <w:szCs w:val="21"/>
-        </w:rPr>
-        <w:t xml:space="preserve">The </w:t>
-      </w:r>
-      <w:r>
-        <w:rPr>
-          <w:rFonts w:ascii="Cambria" w:cs="Cambria" w:eastAsia="Cambria" w:hAnsi="Cambria"/>
-          <w:b/>
-          <w:bCs/>
-          <w:sz w:val="21"/>
-          <w:szCs w:val="21"/>
-        </w:rPr>
-        <w:t xml:space="preserve">Standing Order prevails</w:t>
-      </w:r>
-      <w:r>
-        <w:rPr>
-          <w:rFonts w:ascii="Cambria" w:cs="Cambria" w:eastAsia="Cambria" w:hAnsi="Cambria"/>
-          <w:sz w:val="21"/>
-          <w:szCs w:val="21"/>
-        </w:rPr>
-        <w:t xml:space="preserve">. It has statutory force and binds both parties, so the inconsistent part of the special agreement was ineffective and unenforceable. On completing two months Prem Singh became permanent, and reinstatement was upheld.</w:t>
-      </w:r>
-    </w:p>
-    <w:p>
-      <w:pPr>
-        <w:spacing w:after="80" w:line="270"/>
-        <w:ind w:left="345"/>
-        <w:jc w:val="both"/>
-      </w:pPr>
-      <w:r>
-        <w:rPr>
-          <w:rFonts w:ascii="Cambria" w:cs="Cambria" w:eastAsia="Cambria" w:hAnsi="Cambria"/>
-          <w:b/>
-          <w:bCs/>
-          <w:i/>
-          <w:iCs/>
-          <w:sz w:val="21"/>
-          <w:szCs w:val="21"/>
-        </w:rPr>
-        <w:t xml:space="preserve">Principle. </w:t>
-      </w:r>
-      <w:r>
-        <w:rPr>
-          <w:rFonts w:ascii="Cambria" w:cs="Cambria" w:eastAsia="Cambria" w:hAnsi="Cambria"/>
-          <w:sz w:val="21"/>
-          <w:szCs w:val="21"/>
-        </w:rPr>
-        <w:t xml:space="preserve">Certified Standing Orders prevail over an inconsistent individual contract of employment. Cite this whenever the question is whether an employer can contract out of a certified term.</w:t>
-      </w:r>
-    </w:p>
-    <w:p>
-      <w:pPr>
-        <w:keepNext/>
-        <w:pBdr>
-          <w:left w:val="single" w:color="808080" w:sz="12" w:space="8"/>
-        </w:pBdr>
-        <w:spacing w:after="80" w:before="200"/>
-        <w:ind w:left="172"/>
-      </w:pPr>
-      <w:r>
-        <w:rPr>
-          <w:rFonts w:ascii="Cambria" w:cs="Cambria" w:eastAsia="Cambria" w:hAnsi="Cambria"/>
-          <w:b/>
-          <w:bCs/>
-          <w:sz w:val="22"/>
-          <w:szCs w:val="22"/>
-        </w:rPr>
-        <w:t xml:space="preserve">Management, Shahdara (Delhi) Saharanpur Light Railway Co. Ltd. v. S.S. Railway Workers’ Union, AIR 1969 SC 513</w:t>
-      </w:r>
-    </w:p>
-    <w:p>
-      <w:pPr>
-        <w:spacing w:after="80" w:line="270"/>
-        <w:ind w:left="345"/>
-        <w:jc w:val="both"/>
-      </w:pPr>
-      <w:r>
-        <w:rPr>
-          <w:rFonts w:ascii="Cambria" w:cs="Cambria" w:eastAsia="Cambria" w:hAnsi="Cambria"/>
-          <w:b/>
-          <w:bCs/>
-          <w:i/>
-          <w:iCs/>
-          <w:sz w:val="21"/>
-          <w:szCs w:val="21"/>
-        </w:rPr>
-        <w:t xml:space="preserve">Court and date. </w:t>
-      </w:r>
-      <w:r>
-        <w:rPr>
-          <w:rFonts w:ascii="Cambria" w:cs="Cambria" w:eastAsia="Cambria" w:hAnsi="Cambria"/>
-          <w:sz w:val="21"/>
-          <w:szCs w:val="21"/>
-        </w:rPr>
-        <w:t xml:space="preserve">Supreme Court of India; J.M. Shelat, V. Bhargava and C.A. Vaidialingam JJ; 18 September 1968.</w:t>
-      </w:r>
-    </w:p>
-    <w:p>
-      <w:pPr>
-        <w:spacing w:after="80" w:line="270"/>
-        <w:ind w:left="345"/>
-        <w:jc w:val="both"/>
-      </w:pPr>
-      <w:r>
-        <w:rPr>
-          <w:rFonts w:ascii="Cambria" w:cs="Cambria" w:eastAsia="Cambria" w:hAnsi="Cambria"/>
-          <w:b/>
-          <w:bCs/>
-          <w:i/>
-          <w:iCs/>
-          <w:sz w:val="21"/>
-          <w:szCs w:val="21"/>
-        </w:rPr>
-        <w:t xml:space="preserve">Facts. </w:t>
-      </w:r>
-      <w:r>
-        <w:rPr>
-          <w:rFonts w:ascii="Cambria" w:cs="Cambria" w:eastAsia="Cambria" w:hAnsi="Cambria"/>
-          <w:sz w:val="21"/>
-          <w:szCs w:val="21"/>
-        </w:rPr>
-        <w:t xml:space="preserve">Six months after the Company’s modified Standing Orders came into force, the Union applied under </w:t>
-      </w:r>
-      <w:r>
-        <w:rPr>
-          <w:rFonts w:ascii="Cambria" w:cs="Cambria" w:eastAsia="Cambria" w:hAnsi="Cambria"/>
-          <w:b/>
-          <w:bCs/>
-          <w:sz w:val="21"/>
-          <w:szCs w:val="21"/>
-        </w:rPr>
-        <w:t xml:space="preserve">section 10(2)</w:t>
-      </w:r>
-      <w:r>
-        <w:rPr>
-          <w:rFonts w:ascii="Cambria" w:cs="Cambria" w:eastAsia="Cambria" w:hAnsi="Cambria"/>
-          <w:sz w:val="21"/>
-          <w:szCs w:val="21"/>
-        </w:rPr>
-        <w:t xml:space="preserve"> for further modification. The certifying officer and, on appeal, the Appellate Authority allowed some modifications. The Company appealed under Article 136, objecting to </w:t>
-      </w:r>
-      <w:r>
-        <w:rPr>
-          <w:rFonts w:ascii="Cambria" w:cs="Cambria" w:eastAsia="Cambria" w:hAnsi="Cambria"/>
-          <w:b/>
-          <w:bCs/>
-          <w:sz w:val="21"/>
-          <w:szCs w:val="21"/>
-        </w:rPr>
-        <w:t xml:space="preserve">four</w:t>
-      </w:r>
-      <w:r>
-        <w:rPr>
-          <w:rFonts w:ascii="Cambria" w:cs="Cambria" w:eastAsia="Cambria" w:hAnsi="Cambria"/>
-          <w:sz w:val="21"/>
-          <w:szCs w:val="21"/>
-        </w:rPr>
-        <w:t xml:space="preserve">: that reasons be given and communicated even on a discharge simpliciter; that appeals against penalties be disposed of within sixty days; that on removal for physical unfitness or inefficiency the Company offer alternative employment on reasonable emoluments; and that a </w:t>
-      </w:r>
-      <w:r>
-        <w:rPr>
-          <w:rFonts w:ascii="Cambria" w:cs="Cambria" w:eastAsia="Cambria" w:hAnsi="Cambria"/>
-          <w:b/>
-          <w:bCs/>
-          <w:sz w:val="21"/>
-          <w:szCs w:val="21"/>
-        </w:rPr>
-        <w:t xml:space="preserve">second show-cause notice</w:t>
-      </w:r>
-      <w:r>
-        <w:rPr>
-          <w:rFonts w:ascii="Cambria" w:cs="Cambria" w:eastAsia="Cambria" w:hAnsi="Cambria"/>
-          <w:sz w:val="21"/>
-          <w:szCs w:val="21"/>
-        </w:rPr>
-        <w:t xml:space="preserve"> be served at the punishment stage.</w:t>
-      </w:r>
-    </w:p>
-    <w:p>
-      <w:pPr>
-        <w:spacing w:after="80" w:line="270"/>
-        <w:ind w:left="345"/>
-        <w:jc w:val="both"/>
-      </w:pPr>
-      <w:r>
-        <w:rPr>
-          <w:rFonts w:ascii="Cambria" w:cs="Cambria" w:eastAsia="Cambria" w:hAnsi="Cambria"/>
-          <w:b/>
-          <w:bCs/>
-          <w:i/>
-          <w:iCs/>
-          <w:sz w:val="21"/>
-          <w:szCs w:val="21"/>
-        </w:rPr>
-        <w:t xml:space="preserve">Issue. </w:t>
-      </w:r>
-      <w:r>
-        <w:rPr>
-          <w:rFonts w:ascii="Cambria" w:cs="Cambria" w:eastAsia="Cambria" w:hAnsi="Cambria"/>
-          <w:sz w:val="21"/>
-          <w:szCs w:val="21"/>
-        </w:rPr>
-        <w:t xml:space="preserve">Whether a change of circumstances is a precondition to modification, and whether the four modifications were reasonable.</w:t>
-      </w:r>
-    </w:p>
-    <w:p>
-      <w:pPr>
-        <w:spacing w:after="80" w:line="270"/>
-        <w:ind w:left="345"/>
-        <w:jc w:val="both"/>
-      </w:pPr>
-      <w:r>
-        <w:rPr>
-          <w:rFonts w:ascii="Cambria" w:cs="Cambria" w:eastAsia="Cambria" w:hAnsi="Cambria"/>
-          <w:b/>
-          <w:bCs/>
-          <w:i/>
-          <w:iCs/>
-          <w:sz w:val="21"/>
-          <w:szCs w:val="21"/>
-        </w:rPr>
-        <w:t xml:space="preserve">Held. </w:t>
-      </w:r>
-      <w:r>
-        <w:rPr>
-          <w:rFonts w:ascii="Cambria" w:cs="Cambria" w:eastAsia="Cambria" w:hAnsi="Cambria"/>
-          <w:sz w:val="21"/>
-          <w:szCs w:val="21"/>
-        </w:rPr>
-        <w:t xml:space="preserve">A </w:t>
-      </w:r>
-      <w:r>
-        <w:rPr>
-          <w:rFonts w:ascii="Cambria" w:cs="Cambria" w:eastAsia="Cambria" w:hAnsi="Cambria"/>
-          <w:b/>
-          <w:bCs/>
-          <w:sz w:val="21"/>
-          <w:szCs w:val="21"/>
-        </w:rPr>
-        <w:t xml:space="preserve">change of circumstances is not a condition precedent</w:t>
-      </w:r>
-      <w:r>
-        <w:rPr>
-          <w:rFonts w:ascii="Cambria" w:cs="Cambria" w:eastAsia="Cambria" w:hAnsi="Cambria"/>
-          <w:sz w:val="21"/>
-          <w:szCs w:val="21"/>
-        </w:rPr>
-        <w:t xml:space="preserve">; the only limits are reasonableness and fairness and the six-month interval. The appeal was </w:t>
-      </w:r>
-      <w:r>
-        <w:rPr>
-          <w:rFonts w:ascii="Cambria" w:cs="Cambria" w:eastAsia="Cambria" w:hAnsi="Cambria"/>
-          <w:b/>
-          <w:bCs/>
-          <w:sz w:val="21"/>
-          <w:szCs w:val="21"/>
-        </w:rPr>
-        <w:t xml:space="preserve">partly allowed</w:t>
-      </w:r>
-      <w:r>
-        <w:rPr>
-          <w:rFonts w:ascii="Cambria" w:cs="Cambria" w:eastAsia="Cambria" w:hAnsi="Cambria"/>
-          <w:sz w:val="21"/>
-          <w:szCs w:val="21"/>
-        </w:rPr>
-        <w:t xml:space="preserve">: the </w:t>
-      </w:r>
-      <w:r>
-        <w:rPr>
-          <w:rFonts w:ascii="Cambria" w:cs="Cambria" w:eastAsia="Cambria" w:hAnsi="Cambria"/>
-          <w:b/>
-          <w:bCs/>
-          <w:sz w:val="21"/>
-          <w:szCs w:val="21"/>
-        </w:rPr>
-        <w:t xml:space="preserve">second show-cause notice requirement was set aside</w:t>
-      </w:r>
-      <w:r>
-        <w:rPr>
-          <w:rFonts w:ascii="Cambria" w:cs="Cambria" w:eastAsia="Cambria" w:hAnsi="Cambria"/>
-          <w:sz w:val="21"/>
-          <w:szCs w:val="21"/>
-        </w:rPr>
-        <w:t xml:space="preserve"> as neither reasonable nor fair, since it would equate departmental enquiries with trials and unduly prolong them. The other three were upheld.</w:t>
-      </w:r>
-    </w:p>
-    <w:p>
-      <w:pPr>
-        <w:spacing w:after="80" w:line="270"/>
-        <w:ind w:left="345"/>
-        <w:jc w:val="both"/>
-      </w:pPr>
-      <w:r>
-        <w:rPr>
-          <w:rFonts w:ascii="Cambria" w:cs="Cambria" w:eastAsia="Cambria" w:hAnsi="Cambria"/>
-          <w:b/>
-          <w:bCs/>
-          <w:i/>
-          <w:iCs/>
-          <w:sz w:val="21"/>
-          <w:szCs w:val="21"/>
-        </w:rPr>
-        <w:t xml:space="preserve">Principle. </w:t>
-      </w:r>
-      <w:r>
-        <w:rPr>
-          <w:rFonts w:ascii="Cambria" w:cs="Cambria" w:eastAsia="Cambria" w:hAnsi="Cambria"/>
-          <w:sz w:val="21"/>
-          <w:szCs w:val="21"/>
-        </w:rPr>
-        <w:t xml:space="preserve">A modification is itself subject to the fairness and reasonableness standard introduced in 1956.</w:t>
-      </w:r>
-    </w:p>
-    <w:p>
-      <w:pPr>
-        <w:keepNext/>
-        <w:pBdr>
-          <w:left w:val="single" w:color="808080" w:sz="12" w:space="8"/>
-        </w:pBdr>
-        <w:spacing w:after="80" w:before="200"/>
-        <w:ind w:left="172"/>
-      </w:pPr>
-      <w:r>
-        <w:rPr>
-          <w:rFonts w:ascii="Cambria" w:cs="Cambria" w:eastAsia="Cambria" w:hAnsi="Cambria"/>
-          <w:b/>
-          <w:bCs/>
-          <w:sz w:val="22"/>
-          <w:szCs w:val="22"/>
-        </w:rPr>
-        <w:t xml:space="preserve">Balakrishna Pillai v. Anant Engineering Works Pvt. Ltd., (1975) II LLJ 391</w:t>
-      </w:r>
-    </w:p>
-    <w:p>
-      <w:pPr>
-        <w:spacing w:after="80" w:line="270"/>
-        <w:ind w:left="345"/>
-        <w:jc w:val="both"/>
-      </w:pPr>
-      <w:r>
-        <w:rPr>
-          <w:rFonts w:ascii="Cambria" w:cs="Cambria" w:eastAsia="Cambria" w:hAnsi="Cambria"/>
-          <w:b/>
-          <w:bCs/>
-          <w:i/>
-          <w:iCs/>
-          <w:sz w:val="21"/>
-          <w:szCs w:val="21"/>
-        </w:rPr>
-        <w:t xml:space="preserve">Court and date. </w:t>
-      </w:r>
-      <w:r>
-        <w:rPr>
-          <w:rFonts w:ascii="Cambria" w:cs="Cambria" w:eastAsia="Cambria" w:hAnsi="Cambria"/>
-          <w:sz w:val="21"/>
-          <w:szCs w:val="21"/>
-        </w:rPr>
-        <w:t xml:space="preserve">Bombay High Court, Division Bench (Sawant J). A </w:t>
-      </w:r>
-      <w:r>
-        <w:rPr>
-          <w:rFonts w:ascii="Cambria" w:cs="Cambria" w:eastAsia="Cambria" w:hAnsi="Cambria"/>
-          <w:b/>
-          <w:bCs/>
-          <w:sz w:val="21"/>
-          <w:szCs w:val="21"/>
-        </w:rPr>
-        <w:t xml:space="preserve">High Court</w:t>
-      </w:r>
-      <w:r>
-        <w:rPr>
-          <w:rFonts w:ascii="Cambria" w:cs="Cambria" w:eastAsia="Cambria" w:hAnsi="Cambria"/>
-          <w:sz w:val="21"/>
-          <w:szCs w:val="21"/>
-        </w:rPr>
-        <w:t xml:space="preserve"> decision, not a Supreme Court one.</w:t>
-      </w:r>
-    </w:p>
-    <w:p>
-      <w:pPr>
-        <w:spacing w:after="80" w:line="270"/>
-        <w:ind w:left="345"/>
-        <w:jc w:val="both"/>
-      </w:pPr>
-      <w:r>
-        <w:rPr>
-          <w:rFonts w:ascii="Cambria" w:cs="Cambria" w:eastAsia="Cambria" w:hAnsi="Cambria"/>
-          <w:b/>
-          <w:bCs/>
-          <w:i/>
-          <w:iCs/>
-          <w:sz w:val="21"/>
-          <w:szCs w:val="21"/>
-        </w:rPr>
-        <w:t xml:space="preserve">Facts. </w:t>
-      </w:r>
-      <w:r>
-        <w:rPr>
-          <w:rFonts w:ascii="Cambria" w:cs="Cambria" w:eastAsia="Cambria" w:hAnsi="Cambria"/>
-          <w:sz w:val="21"/>
-          <w:szCs w:val="21"/>
-        </w:rPr>
-        <w:t xml:space="preserve">Thirty-four workmen were </w:t>
-      </w:r>
-      <w:r>
-        <w:rPr>
-          <w:rFonts w:ascii="Cambria" w:cs="Cambria" w:eastAsia="Cambria" w:hAnsi="Cambria"/>
-          <w:b/>
-          <w:bCs/>
-          <w:sz w:val="21"/>
-          <w:szCs w:val="21"/>
-        </w:rPr>
-        <w:t xml:space="preserve">laid off for ten days on fifty per cent wages</w:t>
-      </w:r>
-      <w:r>
-        <w:rPr>
-          <w:rFonts w:ascii="Cambria" w:cs="Cambria" w:eastAsia="Cambria" w:hAnsi="Cambria"/>
-          <w:sz w:val="21"/>
-          <w:szCs w:val="21"/>
-        </w:rPr>
-        <w:t xml:space="preserve">. They claimed full wages, contending that the Standing Orders permitting lay-off did not apply because the establishment then employed </w:t>
-      </w:r>
-      <w:r>
-        <w:rPr>
-          <w:rFonts w:ascii="Cambria" w:cs="Cambria" w:eastAsia="Cambria" w:hAnsi="Cambria"/>
-          <w:b/>
-          <w:bCs/>
-          <w:sz w:val="21"/>
-          <w:szCs w:val="21"/>
-        </w:rPr>
-        <w:t xml:space="preserve">fewer than one hundred workmen</w:t>
-      </w:r>
-      <w:r>
-        <w:rPr>
-          <w:rFonts w:ascii="Cambria" w:cs="Cambria" w:eastAsia="Cambria" w:hAnsi="Cambria"/>
-          <w:sz w:val="21"/>
-          <w:szCs w:val="21"/>
-        </w:rPr>
-        <w:t xml:space="preserve">, the statutory threshold at the time.</w:t>
-      </w:r>
-    </w:p>
-    <w:p>
-      <w:pPr>
-        <w:spacing w:after="80" w:line="270"/>
-        <w:ind w:left="345"/>
-        <w:jc w:val="both"/>
-      </w:pPr>
-      <w:r>
-        <w:rPr>
-          <w:rFonts w:ascii="Cambria" w:cs="Cambria" w:eastAsia="Cambria" w:hAnsi="Cambria"/>
-          <w:b/>
-          <w:bCs/>
-          <w:i/>
-          <w:iCs/>
-          <w:sz w:val="21"/>
-          <w:szCs w:val="21"/>
-        </w:rPr>
-        <w:t xml:space="preserve">Issue. </w:t>
-      </w:r>
-      <w:r>
-        <w:rPr>
-          <w:rFonts w:ascii="Cambria" w:cs="Cambria" w:eastAsia="Cambria" w:hAnsi="Cambria"/>
-          <w:sz w:val="21"/>
-          <w:szCs w:val="21"/>
-        </w:rPr>
-        <w:t xml:space="preserve">Whether the Standing Orders Act ceases to apply once the workforce falls below the threshold.</w:t>
-      </w:r>
-    </w:p>
-    <w:p>
-      <w:pPr>
-        <w:spacing w:after="80" w:line="270"/>
-        <w:ind w:left="345"/>
-        <w:jc w:val="both"/>
-      </w:pPr>
-      <w:r>
-        <w:rPr>
-          <w:rFonts w:ascii="Cambria" w:cs="Cambria" w:eastAsia="Cambria" w:hAnsi="Cambria"/>
-          <w:b/>
-          <w:bCs/>
-          <w:i/>
-          <w:iCs/>
-          <w:sz w:val="21"/>
-          <w:szCs w:val="21"/>
-        </w:rPr>
-        <w:t xml:space="preserve">Held. </w:t>
-      </w:r>
-      <w:r>
-        <w:rPr>
-          <w:rFonts w:ascii="Cambria" w:cs="Cambria" w:eastAsia="Cambria" w:hAnsi="Cambria"/>
-          <w:sz w:val="21"/>
-          <w:szCs w:val="21"/>
-        </w:rPr>
-        <w:t xml:space="preserve">Nothing in the Act provides for cessation merely because the number later falls below the threshold. Being </w:t>
-      </w:r>
-      <w:r>
-        <w:rPr>
-          <w:rFonts w:ascii="Cambria" w:cs="Cambria" w:eastAsia="Cambria" w:hAnsi="Cambria"/>
-          <w:b/>
-          <w:bCs/>
-          <w:sz w:val="21"/>
-          <w:szCs w:val="21"/>
-        </w:rPr>
-        <w:t xml:space="preserve">beneficial legislation</w:t>
-      </w:r>
-      <w:r>
-        <w:rPr>
-          <w:rFonts w:ascii="Cambria" w:cs="Cambria" w:eastAsia="Cambria" w:hAnsi="Cambria"/>
-          <w:sz w:val="21"/>
-          <w:szCs w:val="21"/>
-        </w:rPr>
-        <w:t xml:space="preserve">, once the Act applies it continues to apply, and the Standing Orders including the lay-off provisions remain in force.</w:t>
-      </w:r>
-    </w:p>
-    <w:p>
-      <w:pPr>
-        <w:spacing w:after="80" w:line="270"/>
-        <w:ind w:left="345"/>
-        <w:jc w:val="both"/>
-      </w:pPr>
-      <w:r>
-        <w:rPr>
-          <w:rFonts w:ascii="Cambria" w:cs="Cambria" w:eastAsia="Cambria" w:hAnsi="Cambria"/>
-          <w:b/>
-          <w:bCs/>
-          <w:i/>
-          <w:iCs/>
-          <w:sz w:val="21"/>
-          <w:szCs w:val="21"/>
-        </w:rPr>
-        <w:t xml:space="preserve">Principle. </w:t>
-      </w:r>
-      <w:r>
-        <w:rPr>
-          <w:rFonts w:ascii="Cambria" w:cs="Cambria" w:eastAsia="Cambria" w:hAnsi="Cambria"/>
-          <w:sz w:val="21"/>
-          <w:szCs w:val="21"/>
-        </w:rPr>
-        <w:t xml:space="preserve">The purpose is stability. Otherwise certified standing orders would lapse and revive unpredictably, and an employer could escape the Act by managing numbers.</w:t>
+        <w:t xml:space="preserve"> where work is done through an intermediary.</w:t>
       </w:r>
     </w:p>
     <w:p>

</xml_diff>